<commit_message>
Rewrite ENGL1102 Unit 5 discussion to full rubric compliance with 3 APA citations
</commit_message>
<xml_diff>
--- a/ENGL1102_English_Composition_2/Unit5_Research_Methods/Discussion/Unit5_Discussion_Assignment.docx
+++ b/ENGL1102_English_Composition_2/Unit5_Research_Methods/Discussion/Unit5_Discussion_Assignment.docx
@@ -6,7 +6,7 @@
     <w:p>
       <w:pPr>
         <w:pStyle w:val="Heading1"/>
-        <w:spacing w:lineRule="atLeast" w:line="480"/>
+        <w:spacing w:line="360" w:lineRule="exact"/>
       </w:pPr>
       <w:r>
         <w:rPr>
@@ -19,7 +19,7 @@
     <w:p>
       <w:pPr>
         <w:pStyle w:val="FirstParagraph"/>
-        <w:spacing w:lineRule="atLeast" w:line="480"/>
+        <w:spacing w:line="360" w:lineRule="exact"/>
       </w:pPr>
       <w:r>
         <w:rPr>
@@ -109,7 +109,7 @@
     </w:p>
     <w:p>
       <w:pPr>
-        <w:spacing w:lineRule="atLeast" w:line="480"/>
+        <w:spacing w:line="360" w:lineRule="exact"/>
       </w:pPr>
       <w:r>
         <w:rPr>
@@ -125,7 +125,7 @@
     <w:p>
       <w:pPr>
         <w:pStyle w:val="Heading2"/>
-        <w:spacing w:lineRule="atLeast" w:line="480"/>
+        <w:spacing w:line="360" w:lineRule="exact"/>
       </w:pPr>
       <w:r>
         <w:rPr>
@@ -137,7 +137,20 @@
     </w:p>
     <w:p>
       <w:pPr>
-        <w:spacing w:lineRule="atLeast" w:line="480"/>
+        <w:pStyle w:val="FirstParagraph"/>
+        <w:spacing w:line="360" w:lineRule="exact"/>
+      </w:pPr>
+      <w:r>
+        <w:rPr>
+          <w:rFonts w:ascii="Times New Roman" w:hAnsi="Times New Roman"/>
+          <w:sz w:val="24"/>
+        </w:rPr>
+        <w:t xml:space="preserve">The following email demonstrates professional communication skills while identifying and justifying a research methodology appropriate for a study on cybersecurity awareness in small businesses. As Ashman et al. (2021) note, persuasive professional messages must be clear, purposeful, and audience-centered to achieve their intended effect.</w:t>
+      </w:r>
+    </w:p>
+    <w:p>
+      <w:pPr>
+        <w:spacing w:line="360" w:lineRule="exact"/>
       </w:pPr>
       <w:r>
         <w:rPr>
@@ -152,7 +165,7 @@
     <w:p>
       <w:pPr>
         <w:pStyle w:val="FirstParagraph"/>
-        <w:spacing w:lineRule="atLeast" w:line="480"/>
+        <w:spacing w:line="360" w:lineRule="exact"/>
       </w:pPr>
       <w:r>
         <w:rPr>
@@ -168,13 +181,13 @@
           <w:rFonts w:ascii="Times New Roman" w:hAnsi="Times New Roman"/>
           <w:sz w:val="24"/>
         </w:rPr>
-        <w:t xml:space="preserve">: Research Collaboration Inquiry – Cybersecurity Awareness in Small Businesses</w:t>
+        <w:t xml:space="preserve">: Research Guidance Request – Cybersecurity Awareness Study in SMEs</w:t>
       </w:r>
     </w:p>
     <w:p>
       <w:pPr>
         <w:pStyle w:val="BodyText"/>
-        <w:spacing w:lineRule="atLeast" w:line="480"/>
+        <w:spacing w:line="360" w:lineRule="exact"/>
       </w:pPr>
       <w:r>
         <w:rPr>
@@ -187,27 +200,27 @@
     <w:p>
       <w:pPr>
         <w:pStyle w:val="BodyText"/>
-        <w:spacing w:lineRule="atLeast" w:line="480"/>
-      </w:pPr>
-      <w:r>
-        <w:rPr>
-          <w:rFonts w:ascii="Times New Roman" w:hAnsi="Times New Roman"/>
-          <w:sz w:val="24"/>
-        </w:rPr>
-        <w:t xml:space="preserve">My name is Nicanor Kyamba, a second-year student in the Computer Science program at the University of the People. I am writing to seek your guidance on a research project I am developing on cybersecurity awareness and compliance among small and medium-sized enterprises (SMEs) in sub-Saharan Africa.</w:t>
+        <w:spacing w:line="360" w:lineRule="exact"/>
+      </w:pPr>
+      <w:r>
+        <w:rPr>
+          <w:rFonts w:ascii="Times New Roman" w:hAnsi="Times New Roman"/>
+          <w:sz w:val="24"/>
+        </w:rPr>
+        <w:t xml:space="preserve">My name is Nicanor Kyamba, a second-year Computer Science student at the University of the People. I am writing to seek your expert guidance on a research project I am developing that examines cybersecurity awareness and training practices among small and medium-sized enterprises (SMEs) in sub-Saharan Africa.</w:t>
       </w:r>
     </w:p>
     <w:p>
       <w:pPr>
         <w:pStyle w:val="BodyText"/>
-        <w:spacing w:lineRule="atLeast" w:line="480"/>
-      </w:pPr>
-      <w:r>
-        <w:rPr>
-          <w:rFonts w:ascii="Times New Roman" w:hAnsi="Times New Roman"/>
-          <w:sz w:val="24"/>
-        </w:rPr>
-        <w:t xml:space="preserve">My research investigates the following question:</w:t>
+        <w:spacing w:line="360" w:lineRule="exact"/>
+      </w:pPr>
+      <w:r>
+        <w:rPr>
+          <w:rFonts w:ascii="Times New Roman" w:hAnsi="Times New Roman"/>
+          <w:sz w:val="24"/>
+        </w:rPr>
+        <w:t xml:space="preserve">My central research question is:</w:t>
       </w:r>
       <w:r>
         <w:rPr>
@@ -223,7 +236,7 @@
           <w:iCs/>
           <w:sz w:val="24"/>
         </w:rPr>
-        <w:t xml:space="preserve">To what extent does employee cybersecurity training frequency correlate with the incidence of security breaches in SMEs?</w:t>
+        <w:t xml:space="preserve">To what extent does employee cybersecurity training frequency correlate with the incidence of security breaches in SMEs, and what organizational factors explain this relationship?</w:t>
       </w:r>
       <w:r>
         <w:rPr>
@@ -237,7 +250,7 @@
           <w:rFonts w:ascii="Times New Roman" w:hAnsi="Times New Roman"/>
           <w:sz w:val="24"/>
         </w:rPr>
-        <w:t xml:space="preserve">To address this question, I intend to employ a</w:t>
+        <w:t xml:space="preserve">To address this question comprehensively, I propose a</w:t>
       </w:r>
       <w:r>
         <w:rPr>
@@ -260,39 +273,46 @@
           <w:rFonts w:ascii="Times New Roman" w:hAnsi="Times New Roman"/>
           <w:sz w:val="24"/>
         </w:rPr>
-        <w:t xml:space="preserve">. Specifically, I plan to use a quantitative survey to measure training frequency and breach incidence across a sample of 150 SMEs, followed by qualitative interviews with IT managers to explore the organizational factors that explain the patterns observed in the survey data.</w:t>
+        <w:t xml:space="preserve"> </w:t>
+      </w:r>
+      <w:r>
+        <w:rPr>
+          <w:rFonts w:ascii="Times New Roman" w:hAnsi="Times New Roman"/>
+          <w:sz w:val="24"/>
+        </w:rPr>
+        <w:t xml:space="preserve">— combining a quantitative survey administered to 150 SMEs with follow-up qualitative interviews with IT managers.</w:t>
       </w:r>
     </w:p>
     <w:p>
       <w:pPr>
         <w:pStyle w:val="BodyText"/>
-        <w:spacing w:lineRule="atLeast" w:line="480"/>
-      </w:pPr>
-      <w:r>
-        <w:rPr>
-          <w:rFonts w:ascii="Times New Roman" w:hAnsi="Times New Roman"/>
-          <w:sz w:val="24"/>
-        </w:rPr>
-        <w:t xml:space="preserve">I have chosen mixed-methods because neither approach alone would fully answer my research question. As Serdikoff (2021) explains, quantitative methods are best suited for measuring relationships between variables, while qualitative methods uncover the deeper contextual factors that numbers alone cannot reveal (Section 36). By combining both, I can achieve both the breadth needed to identify trends and the depth needed to understand them. National University (2024) further supports this approach, noting that mixed-methods designs are particularly valuable when research questions require both statistical evidence and experiential insight.</w:t>
+        <w:spacing w:line="360" w:lineRule="exact"/>
+      </w:pPr>
+      <w:r>
+        <w:rPr>
+          <w:rFonts w:ascii="Times New Roman" w:hAnsi="Times New Roman"/>
+          <w:sz w:val="24"/>
+        </w:rPr>
+        <w:t xml:space="preserve">I have selected mixed-methods because the research question has two distinct dimensions that neither approach alone can fully address. As Serdikoff (2021) explains, quantitative methods are best suited for measuring relationships between variables, while qualitative methods reveal the deeper contextual and experiential factors that numerical data cannot capture (Section 36). National University (2024) further affirms that mixed-methods designs are particularly valuable when a study requires both statistical breadth and interpretive depth. By integrating both approaches, I can measure the prevalence of training gaps and simultaneously understand why those gaps persist within organizations.</w:t>
       </w:r>
     </w:p>
     <w:p>
       <w:pPr>
         <w:pStyle w:val="BodyText"/>
-        <w:spacing w:lineRule="atLeast" w:line="480"/>
-      </w:pPr>
-      <w:r>
-        <w:rPr>
-          <w:rFonts w:ascii="Times New Roman" w:hAnsi="Times New Roman"/>
-          <w:sz w:val="24"/>
-        </w:rPr>
-        <w:t xml:space="preserve">I would greatly appreciate your feedback on the feasibility of this methodology and any guidance on appropriate sampling strategies for this context. I am available for a brief meeting at your convenience and can be reached at nicanorkyamba98@gmail.com.</w:t>
+        <w:spacing w:line="360" w:lineRule="exact"/>
+      </w:pPr>
+      <w:r>
+        <w:rPr>
+          <w:rFonts w:ascii="Times New Roman" w:hAnsi="Times New Roman"/>
+          <w:sz w:val="24"/>
+        </w:rPr>
+        <w:t xml:space="preserve">I would greatly value your feedback on the feasibility of this methodology and your recommendations on appropriate sampling strategies for this regional context. I am available at your convenience and can be reached at nicanorkyamba98@gmail.com.</w:t>
       </w:r>
     </w:p>
     <w:p>
       <w:pPr>
         <w:pStyle w:val="BodyText"/>
-        <w:spacing w:lineRule="atLeast" w:line="480"/>
+        <w:spacing w:line="360" w:lineRule="exact"/>
       </w:pPr>
       <w:r>
         <w:rPr>
@@ -305,7 +325,7 @@
     <w:p>
       <w:pPr>
         <w:pStyle w:val="BodyText"/>
-        <w:spacing w:lineRule="atLeast" w:line="480"/>
+        <w:spacing w:line="360" w:lineRule="exact"/>
       </w:pPr>
       <w:r>
         <w:rPr>
@@ -319,7 +339,7 @@
           <w:rFonts w:ascii="Times New Roman" w:hAnsi="Times New Roman"/>
           <w:sz w:val="24"/>
         </w:rPr>
-        <w:t xml:space="preserve"> </w:t>
+        <w:br/>
       </w:r>
       <w:r>
         <w:rPr>
@@ -333,7 +353,7 @@
           <w:rFonts w:ascii="Times New Roman" w:hAnsi="Times New Roman"/>
           <w:sz w:val="24"/>
         </w:rPr>
-        <w:t xml:space="preserve"> </w:t>
+        <w:br/>
       </w:r>
       <w:r>
         <w:rPr>
@@ -347,7 +367,7 @@
           <w:rFonts w:ascii="Times New Roman" w:hAnsi="Times New Roman"/>
           <w:sz w:val="24"/>
         </w:rPr>
-        <w:t xml:space="preserve"> </w:t>
+        <w:br/>
       </w:r>
       <w:r>
         <w:rPr>
@@ -359,7 +379,7 @@
     </w:p>
     <w:p>
       <w:pPr>
-        <w:spacing w:lineRule="atLeast" w:line="480"/>
+        <w:spacing w:line="360" w:lineRule="exact"/>
       </w:pPr>
       <w:r>
         <w:rPr>
@@ -376,7 +396,7 @@
     <w:p>
       <w:pPr>
         <w:pStyle w:val="Heading2"/>
-        <w:spacing w:lineRule="atLeast" w:line="480"/>
+        <w:spacing w:line="360" w:lineRule="exact"/>
       </w:pPr>
       <w:r>
         <w:rPr>
@@ -389,14 +409,14 @@
     <w:p>
       <w:pPr>
         <w:pStyle w:val="FirstParagraph"/>
-        <w:spacing w:lineRule="atLeast" w:line="480"/>
-      </w:pPr>
-      <w:r>
-        <w:rPr>
-          <w:rFonts w:ascii="Times New Roman" w:hAnsi="Times New Roman"/>
-          <w:sz w:val="24"/>
-        </w:rPr>
-        <w:t xml:space="preserve">National University. (2024, October 30).</w:t>
+        <w:spacing w:line="360" w:lineRule="exact"/>
+      </w:pPr>
+      <w:r>
+        <w:rPr>
+          <w:rFonts w:ascii="Times New Roman" w:hAnsi="Times New Roman"/>
+          <w:sz w:val="24"/>
+        </w:rPr>
+        <w:t xml:space="preserve">Ashman, M., Cruthers, A., eCampusOntario, Ontario Business Faculty, &amp; University of Minnesota. (2021).</w:t>
       </w:r>
       <w:r>
         <w:rPr>
@@ -412,27 +432,14 @@
           <w:iCs/>
           <w:sz w:val="24"/>
         </w:rPr>
-        <w:t xml:space="preserve">Research writing and analysis</w:t>
-      </w:r>
-      <w:r>
-        <w:rPr>
-          <w:rFonts w:ascii="Times New Roman" w:hAnsi="Times New Roman"/>
-          <w:sz w:val="24"/>
-        </w:rPr>
-        <w:t xml:space="preserve">. Dissertation Center. https://www.nu.edu/blog/research-writing-and-analysis/</w:t>
-      </w:r>
-    </w:p>
-    <w:p>
-      <w:pPr>
-        <w:pStyle w:val="BodyText"/>
-        <w:spacing w:lineRule="atLeast" w:line="480"/>
-      </w:pPr>
-      <w:r>
-        <w:rPr>
-          <w:rFonts w:ascii="Times New Roman" w:hAnsi="Times New Roman"/>
-          <w:sz w:val="24"/>
-        </w:rPr>
-        <w:t xml:space="preserve">Serdikoff, S. (2021).</w:t>
+        <w:t xml:space="preserve">4:7: Persuasive messages</w:t>
+      </w:r>
+      <w:r>
+        <w:rPr>
+          <w:rFonts w:ascii="Times New Roman" w:hAnsi="Times New Roman"/>
+          <w:sz w:val="24"/>
+        </w:rPr>
+        <w:t xml:space="preserve">. In</w:t>
       </w:r>
       <w:r>
         <w:rPr>
@@ -448,6 +455,78 @@
           <w:iCs/>
           <w:sz w:val="24"/>
         </w:rPr>
+        <w:t xml:space="preserve">Advanced Professional Communications</w:t>
+      </w:r>
+      <w:r>
+        <w:rPr>
+          <w:rFonts w:ascii="Times New Roman" w:hAnsi="Times New Roman"/>
+          <w:sz w:val="24"/>
+        </w:rPr>
+        <w:t xml:space="preserve">. Pressbooks. https://ecampusontario.pressbooks.pub/professionalcomms/chapter/4-7-persuasive-messages/</w:t>
+      </w:r>
+    </w:p>
+    <w:p>
+      <w:pPr>
+        <w:pStyle w:val="BodyText"/>
+        <w:spacing w:line="360" w:lineRule="exact"/>
+      </w:pPr>
+      <w:r>
+        <w:rPr>
+          <w:rFonts w:ascii="Times New Roman" w:hAnsi="Times New Roman"/>
+          <w:sz w:val="24"/>
+        </w:rPr>
+        <w:t xml:space="preserve">National University. (2024, October 30).</w:t>
+      </w:r>
+      <w:r>
+        <w:rPr>
+          <w:rFonts w:ascii="Times New Roman" w:hAnsi="Times New Roman"/>
+          <w:sz w:val="24"/>
+        </w:rPr>
+        <w:t xml:space="preserve"> </w:t>
+      </w:r>
+      <w:r>
+        <w:rPr>
+          <w:rFonts w:ascii="Times New Roman" w:hAnsi="Times New Roman"/>
+          <w:i/>
+          <w:iCs/>
+          <w:sz w:val="24"/>
+        </w:rPr>
+        <w:t xml:space="preserve">Research writing and analysis</w:t>
+      </w:r>
+      <w:r>
+        <w:rPr>
+          <w:rFonts w:ascii="Times New Roman" w:hAnsi="Times New Roman"/>
+          <w:sz w:val="24"/>
+        </w:rPr>
+        <w:t xml:space="preserve">. Dissertation Center. https://www.nu.edu/blog/research-writing-and-analysis/</w:t>
+      </w:r>
+    </w:p>
+    <w:p>
+      <w:pPr>
+        <w:pStyle w:val="BodyText"/>
+        <w:spacing w:line="360" w:lineRule="exact"/>
+      </w:pPr>
+      <w:r>
+        <w:rPr>
+          <w:rFonts w:ascii="Times New Roman" w:hAnsi="Times New Roman"/>
+          <w:sz w:val="24"/>
+        </w:rPr>
+        <w:t xml:space="preserve">Serdikoff, S. (2021).</w:t>
+      </w:r>
+      <w:r>
+        <w:rPr>
+          <w:rFonts w:ascii="Times New Roman" w:hAnsi="Times New Roman"/>
+          <w:sz w:val="24"/>
+        </w:rPr>
+        <w:t xml:space="preserve"> </w:t>
+      </w:r>
+      <w:r>
+        <w:rPr>
+          <w:rFonts w:ascii="Times New Roman" w:hAnsi="Times New Roman"/>
+          <w:i/>
+          <w:iCs/>
+          <w:sz w:val="24"/>
+        </w:rPr>
         <w:t xml:space="preserve">Research methods for the behavioral sciences</w:t>
       </w:r>
       <w:r>
@@ -467,7 +546,7 @@
     </w:p>
     <w:p>
       <w:pPr>
-        <w:spacing w:lineRule="atLeast" w:line="480"/>
+        <w:spacing w:line="360" w:lineRule="exact"/>
       </w:pPr>
       <w:r>
         <w:rPr>
@@ -482,7 +561,7 @@
     <w:p>
       <w:pPr>
         <w:pStyle w:val="FirstParagraph"/>
-        <w:spacing w:lineRule="atLeast" w:line="480"/>
+        <w:spacing w:line="360" w:lineRule="exact"/>
       </w:pPr>
       <w:r>
         <w:rPr>
@@ -498,7 +577,7 @@
           <w:rFonts w:ascii="Times New Roman" w:hAnsi="Times New Roman"/>
           <w:sz w:val="24"/>
         </w:rPr>
-        <w:t xml:space="preserve">: 302 words (body of email only, excluding subject line, salutation, sign-off, and references)</w:t>
+        <w:t xml:space="preserve">: 318 words (full post body excluding references)</w:t>
       </w:r>
     </w:p>
     <w:bookmarkEnd w:id="21"/>

</xml_diff>